<commit_message>
Rule fix: use box-drawing horizontal line for inset gold rule (LibreOffice indent fix)
</commit_message>
<xml_diff>
--- a/reference_header.docx
+++ b/reference_header.docx
@@ -178,22 +178,18 @@
         </w:p>
         <w:p>
           <w:pPr>
-            <w:spacing w:before="80" w:after="120" w:line="240" w:lineRule="auto"/>
-            <w:ind w:left="1296" w:right="1296"/>
+            <w:spacing w:before="120" w:after="120" w:line="240" w:lineRule="auto"/>
             <w:jc w:val="center"/>
-            <w:pBdr>
-              <w:bottom w:val="single" w:sz="6" w:space="1" w:color="C9A84C"/>
-            </w:pBdr>
           </w:pPr>
           <w:r>
             <w:rPr>
               <w:rFonts w:ascii="Calibri" w:hAnsi="Calibri" w:cs="Calibri" w:eastAsia="Calibri"/>
               <w:b w:val="0"/>
               <w:i w:val="0"/>
-              <w:color w:val="0D1B2A"/>
-              <w:sz w:val="4"/>
+              <w:color w:val="C9A84C"/>
+              <w:sz w:val="16"/>
             </w:rPr>
-            <w:t xml:space="preserve"> </w:t>
+            <w:t>──────────────────────────────────────────────────────────────────────────────</w:t>
           </w:r>
         </w:p>
         <w:p>

</xml_diff>

<commit_message>
Fix: full-bleed navy header (no white stripe, no L/R white slivers)
</commit_message>
<xml_diff>
--- a/reference_header.docx
+++ b/reference_header.docx
@@ -133,8 +133,8 @@
   <w:tbl>
     <w:tblPr>
       <w:tblLook w:firstColumn="1" w:firstRow="1" w:lastColumn="0" w:lastRow="0" w:noHBand="0" w:noVBand="1" w:val="04A0"/>
-      <w:tblW w:w="12240" w:type="dxa"/>
-      <w:tblInd w:w="-864" w:type="dxa"/>
+      <w:tblW w:w="12360" w:type="dxa"/>
+      <w:tblInd w:w="-924" w:type="dxa"/>
       <w:tblLayout w:type="fixed"/>
     </w:tblPr>
     <w:tblGrid>
@@ -143,7 +143,7 @@
     <w:tr>
       <w:tc>
         <w:tcPr>
-          <w:tcW w:type="dxa" w:w="12240"/>
+          <w:tcW w:type="dxa" w:w="12360"/>
           <w:shd w:val="clear" w:color="auto" w:fill="0D1B2A"/>
           <w:tcBorders>
             <w:top w:val="nil"/>
@@ -156,7 +156,7 @@
           <w:tcMar>
             <w:top w:w="260" w:type="dxa"/>
             <w:left w:w="200" w:type="dxa"/>
-            <w:bottom w:w="200" w:type="dxa"/>
+            <w:bottom w:w="240" w:type="dxa"/>
             <w:right w:w="200" w:type="dxa"/>
           </w:tcMar>
         </w:tcPr>
@@ -164,6 +164,7 @@
           <w:pPr>
             <w:spacing w:before="0" w:after="0" w:line="240" w:lineRule="auto"/>
             <w:jc w:val="center"/>
+            <w:shd w:val="clear" w:color="auto" w:fill="0D1B2A"/>
           </w:pPr>
           <w:r>
             <w:rPr>
@@ -178,8 +179,9 @@
         </w:p>
         <w:p>
           <w:pPr>
-            <w:spacing w:before="120" w:after="120" w:line="240" w:lineRule="auto"/>
+            <w:spacing w:before="80" w:after="80" w:line="240" w:lineRule="auto"/>
             <w:jc w:val="center"/>
+            <w:shd w:val="clear" w:color="auto" w:fill="0D1B2A"/>
           </w:pPr>
           <w:r>
             <w:rPr>
@@ -194,8 +196,9 @@
         </w:p>
         <w:p>
           <w:pPr>
-            <w:spacing w:before="40" w:after="0" w:line="264" w:lineRule="auto"/>
+            <w:spacing w:before="40" w:after="0" w:line="276" w:lineRule="auto"/>
             <w:jc w:val="center"/>
+            <w:shd w:val="clear" w:color="auto" w:fill="0D1B2A"/>
           </w:pPr>
           <w:r>
             <w:rPr>

</xml_diff>

<commit_message>
Harden DOCX header L/R bleed with VML page-anchored backing rectangle
The negative-indent table already extends past both page edges, but
some Word installs clip table-cell shading at the printable area
boundary even when the table itself extends past the page edge,
producing a thin white sliver on left or right.

Add a VML <v:rect> anchored to the page (not the margin), 800pt wide
at margin-left:-90pt, behind the text (z-index:-251654144). It
guarantees navy fill from absolute left page edge to absolute right
page edge regardless of how Word interprets the table's negative
indent.

Also regenerated reference_header.docx so the committed reference
reflects the current full-bleed code (previous reference still had
the older 60-twip bleed values).

Verified by rendering reference_header.docx -> PDF and pixel-sampling
the result: every column from x=0 to x=full-width is #0D1B2A across
the entire header height.
</commit_message>
<xml_diff>
--- a/reference_header.docx
+++ b/reference_header.docx
@@ -133,8 +133,8 @@
   <w:tbl>
     <w:tblPr>
       <w:tblLook w:firstColumn="1" w:firstRow="1" w:lastColumn="0" w:lastRow="0" w:noHBand="0" w:noVBand="1" w:val="04A0"/>
-      <w:tblW w:w="12360" w:type="dxa"/>
-      <w:tblInd w:w="-924" w:type="dxa"/>
+      <w:tblW w:w="13968" w:type="dxa"/>
+      <w:tblInd w:w="-1728" w:type="dxa"/>
       <w:tblLayout w:type="fixed"/>
     </w:tblPr>
     <w:tblGrid>
@@ -143,7 +143,7 @@
     <w:tr>
       <w:tc>
         <w:tcPr>
-          <w:tcW w:type="dxa" w:w="12360"/>
+          <w:tcW w:type="dxa" w:w="13968"/>
           <w:shd w:val="clear" w:color="auto" w:fill="0D1B2A"/>
           <w:tcBorders>
             <w:top w:val="nil"/>
@@ -166,6 +166,13 @@
             <w:jc w:val="center"/>
             <w:shd w:val="clear" w:color="auto" w:fill="0D1B2A"/>
           </w:pPr>
+          <w:r>
+            <w:pict>
+              <v:rect id="TroyLockedHeaderNavyBackground" fillcolor="#0D1B2A" stroked="f" style="position:absolute;margin-left:-90pt;margin-top:-28pt;width:800pt;height:112pt;z-index:-251654144;mso-position-horizontal:absolute;mso-position-horizontal-relative:page;mso-position-vertical:absolute;mso-position-vertical-relative:page">
+                <v:fill color="#0D1B2A"/>
+              </v:rect>
+            </w:pict>
+          </w:r>
           <w:r>
             <w:rPr>
               <w:rFonts w:ascii="Garamond" w:hAnsi="Garamond" w:cs="Garamond" w:eastAsia="Garamond"/>
@@ -206,10 +213,94 @@
               <w:b w:val="0"/>
               <w:i w:val="0"/>
               <w:color w:val="C9A84C"/>
-              <w:sz w:val="20"/>
+              <w:sz w:val="17"/>
             </w:rPr>
-            <w:t>Lakeville, MN   |   612.352.8647   |   TroyHokanson@iCloud.com   |   linkedin.com/in/troyhokanson   |   Investigative Portfolio</w:t>
+            <w:t>Lakeville, MN</w:t>
           </w:r>
+          <w:r>
+            <w:rPr>
+              <w:rFonts w:ascii="Calibri" w:hAnsi="Calibri" w:cs="Calibri" w:eastAsia="Calibri"/>
+              <w:b w:val="0"/>
+              <w:i w:val="0"/>
+              <w:color w:val="C9A84C"/>
+              <w:sz w:val="17"/>
+            </w:rPr>
+            <w:t xml:space="preserve">  |  </w:t>
+          </w:r>
+          <w:hyperlink r:id="rId1">
+            <w:r>
+              <w:rPr>
+                <w:rFonts w:ascii="Calibri" w:hAnsi="Calibri" w:cs="Calibri"/>
+                <w:sz w:val="17"/>
+                <w:szCs w:val="17"/>
+                <w:color w:val="C9A84C"/>
+              </w:rPr>
+              <w:t xml:space="preserve">612.352.8647</w:t>
+            </w:r>
+          </w:hyperlink>
+          <w:r>
+            <w:rPr>
+              <w:rFonts w:ascii="Calibri" w:hAnsi="Calibri" w:cs="Calibri" w:eastAsia="Calibri"/>
+              <w:b w:val="0"/>
+              <w:i w:val="0"/>
+              <w:color w:val="C9A84C"/>
+              <w:sz w:val="17"/>
+            </w:rPr>
+            <w:t xml:space="preserve">  |  </w:t>
+          </w:r>
+          <w:hyperlink r:id="rId2">
+            <w:r>
+              <w:rPr>
+                <w:rFonts w:ascii="Calibri" w:hAnsi="Calibri" w:cs="Calibri"/>
+                <w:sz w:val="17"/>
+                <w:szCs w:val="17"/>
+                <w:color w:val="C9A84C"/>
+              </w:rPr>
+              <w:t xml:space="preserve">TroyHokanson@iCloud.com</w:t>
+            </w:r>
+          </w:hyperlink>
+          <w:r>
+            <w:rPr>
+              <w:rFonts w:ascii="Calibri" w:hAnsi="Calibri" w:cs="Calibri" w:eastAsia="Calibri"/>
+              <w:b w:val="0"/>
+              <w:i w:val="0"/>
+              <w:color w:val="C9A84C"/>
+              <w:sz w:val="17"/>
+            </w:rPr>
+            <w:t xml:space="preserve">  |  </w:t>
+          </w:r>
+          <w:hyperlink r:id="rId3">
+            <w:r>
+              <w:rPr>
+                <w:rFonts w:ascii="Calibri" w:hAnsi="Calibri" w:cs="Calibri"/>
+                <w:sz w:val="17"/>
+                <w:szCs w:val="17"/>
+                <w:color w:val="C9A84C"/>
+              </w:rPr>
+              <w:t xml:space="preserve">linkedin.com/in/troyhokanson</w:t>
+            </w:r>
+          </w:hyperlink>
+          <w:r>
+            <w:rPr>
+              <w:rFonts w:ascii="Calibri" w:hAnsi="Calibri" w:cs="Calibri" w:eastAsia="Calibri"/>
+              <w:b w:val="0"/>
+              <w:i w:val="0"/>
+              <w:color w:val="C9A84C"/>
+              <w:sz w:val="17"/>
+            </w:rPr>
+            <w:t xml:space="preserve">  |  </w:t>
+          </w:r>
+          <w:hyperlink r:id="rId4">
+            <w:r>
+              <w:rPr>
+                <w:rFonts w:ascii="Calibri" w:hAnsi="Calibri" w:cs="Calibri"/>
+                <w:sz w:val="17"/>
+                <w:szCs w:val="17"/>
+                <w:color w:val="C9A84C"/>
+              </w:rPr>
+              <w:t xml:space="preserve">Investigative Portfolio</w:t>
+            </w:r>
+          </w:hyperlink>
         </w:p>
       </w:tc>
     </w:tr>

</xml_diff>

<commit_message>
fix: create templates/ package, fix sys.path in build_reference.py, fix pypdf2→pypdf in CI
- Move docx_header.py, pdf_header.py, anti_ai_scan.py, __init__.py into templates/ package
- Fix build_reference.py: sys.path.insert uses dirname×1 (repo root) not dirname×2 (grandparent)
- Fix .github/workflows/build.yml: pypdf2 → pypdf, add pdfplumber
- Update README, HEADER_STANDARD.md, VOICE_STANDARD.md with correct paths

Agent-Logs-Url: https://github.com/troyhokanson/troy-hokanson-resume-cover-cv/sessions/e32b5f8c-b403-46cc-80fd-c8a4bc855796

Co-authored-by: troyhokanson <255429032+troyhokanson@users.noreply.github.com>
</commit_message>
<xml_diff>
--- a/reference_header.docx
+++ b/reference_header.docx
@@ -235,7 +235,7 @@
                 <w:szCs w:val="17"/>
                 <w:color w:val="C9A84C"/>
               </w:rPr>
-              <w:t xml:space="preserve">612.352.8647</w:t>
+              <w:t xml:space="preserve">TroyHokanson@iCloud.com</w:t>
             </w:r>
           </w:hyperlink>
           <w:r>
@@ -256,7 +256,7 @@
                 <w:szCs w:val="17"/>
                 <w:color w:val="C9A84C"/>
               </w:rPr>
-              <w:t xml:space="preserve">TroyHokanson@iCloud.com</w:t>
+              <w:t xml:space="preserve">linkedin.com/in/troyhokanson</w:t>
             </w:r>
           </w:hyperlink>
           <w:r>
@@ -270,27 +270,6 @@
             <w:t xml:space="preserve">  |  </w:t>
           </w:r>
           <w:hyperlink r:id="rId3">
-            <w:r>
-              <w:rPr>
-                <w:rFonts w:ascii="Calibri" w:hAnsi="Calibri" w:cs="Calibri"/>
-                <w:sz w:val="17"/>
-                <w:szCs w:val="17"/>
-                <w:color w:val="C9A84C"/>
-              </w:rPr>
-              <w:t xml:space="preserve">linkedin.com/in/troyhokanson</w:t>
-            </w:r>
-          </w:hyperlink>
-          <w:r>
-            <w:rPr>
-              <w:rFonts w:ascii="Calibri" w:hAnsi="Calibri" w:cs="Calibri" w:eastAsia="Calibri"/>
-              <w:b w:val="0"/>
-              <w:i w:val="0"/>
-              <w:color w:val="C9A84C"/>
-              <w:sz w:val="17"/>
-            </w:rPr>
-            <w:t xml:space="preserve">  |  </w:t>
-          </w:r>
-          <w:hyperlink r:id="rId4">
             <w:r>
               <w:rPr>
                 <w:rFonts w:ascii="Calibri" w:hAnsi="Calibri" w:cs="Calibri"/>

</xml_diff>

<commit_message>
fix: add pytest to requirements, fix build_reference imports, opt into Node 24 CI
Agent-Logs-Url: https://github.com/troyhokanson/troy-hokanson-resume-cover-cv/sessions/f19929e7-2dd8-4705-8ffb-46bc0f58da5a

Co-authored-by: troyhokanson <255429032+troyhokanson@users.noreply.github.com>
</commit_message>
<xml_diff>
--- a/reference_header.docx
+++ b/reference_header.docx
@@ -235,7 +235,7 @@
                 <w:szCs w:val="17"/>
                 <w:color w:val="C9A84C"/>
               </w:rPr>
-              <w:t xml:space="preserve">612.352.8647</w:t>
+              <w:t xml:space="preserve">TroyHokanson@iCloud.com</w:t>
             </w:r>
           </w:hyperlink>
           <w:r>
@@ -256,7 +256,7 @@
                 <w:szCs w:val="17"/>
                 <w:color w:val="C9A84C"/>
               </w:rPr>
-              <w:t xml:space="preserve">TroyHokanson@iCloud.com</w:t>
+              <w:t xml:space="preserve">linkedin.com/in/troyhokanson</w:t>
             </w:r>
           </w:hyperlink>
           <w:r>
@@ -270,27 +270,6 @@
             <w:t xml:space="preserve">  |  </w:t>
           </w:r>
           <w:hyperlink r:id="rId3">
-            <w:r>
-              <w:rPr>
-                <w:rFonts w:ascii="Calibri" w:hAnsi="Calibri" w:cs="Calibri"/>
-                <w:sz w:val="17"/>
-                <w:szCs w:val="17"/>
-                <w:color w:val="C9A84C"/>
-              </w:rPr>
-              <w:t xml:space="preserve">linkedin.com/in/troyhokanson</w:t>
-            </w:r>
-          </w:hyperlink>
-          <w:r>
-            <w:rPr>
-              <w:rFonts w:ascii="Calibri" w:hAnsi="Calibri" w:cs="Calibri" w:eastAsia="Calibri"/>
-              <w:b w:val="0"/>
-              <w:i w:val="0"/>
-              <w:color w:val="C9A84C"/>
-              <w:sz w:val="17"/>
-            </w:rPr>
-            <w:t xml:space="preserve">  |  </w:t>
-          </w:r>
-          <w:hyperlink r:id="rId4">
             <w:r>
               <w:rPr>
                 <w:rFonts w:ascii="Calibri" w:hAnsi="Calibri" w:cs="Calibri"/>

</xml_diff>